<commit_message>
feat: advance Rivet Ridge Rally RC2 candidate
</commit_message>
<xml_diff>
--- a/docs/RIVET_RIDGE_RALLY_DESIGN_REPORT.docx
+++ b/docs/RIVET_RIDGE_RALLY_DESIGN_REPORT.docx
@@ -942,18 +942,18 @@
         <w:rPr>
           <w:rtl w:val="0"/>
         </w:rPr>
-        <w:t>RIVET RIDGE RALLY 1.0.0-rc.2 has materially addressed two issues that reopened the candidate: fresh profiles now use the arrow cluster for lane and pitch control, and Rider School now teaches the full riding, heat, terrain, landing, and collision loop.</w:t>
-      </w:r>
-    </w:p>
-    <w:p>
-      <w:pPr>
-        <w:rPr/>
-      </w:pPr>
-      <w:r>
-        <w:rPr>
-          <w:rtl w:val="0"/>
-        </w:rPr>
-        <w:t>Concept-art fidelity remains unresolved. The visual response is substantial and repeatable, but owner acceptance, physical device and input review, immutable source identity, and commercial actions remain open. The correct decision is NOT READY.</w:t>
+        <w:t>RIVET RIDGE RALLY 1.0.0-rc.2 source includes arrow-cluster lane defaults, conflict-safe legacy migration, a comprehensive 12-lesson plus two-drill Rider School, and a broad but unaccepted concept-led visual response.</w:t>
+      </w:r>
+    </w:p>
+    <w:p>
+      <w:pPr>
+        <w:rPr/>
+      </w:pPr>
+      <w:r>
+        <w:rPr>
+          <w:rtl w:val="0"/>
+        </w:rPr>
+        <w:t>The candidate is not release-qualified. Test automation remains paused by owner request; the latest source corrections remain behaviorally unverified, concept fidelity is NOT ACCEPTED, and QA, performance, smoke, source-identity, and owner gates remain open. Decision: NOT READY.</w:t>
       </w:r>
     </w:p>
     <w:bookmarkStart w:colFirst="0" w:colLast="0" w:name="bookmark=id.1sqjewf8afxt" w:id="2"/>
@@ -1010,7 +1010,7 @@
           <w:vertAlign w:val="baseline"/>
           <w:rtl w:val="0"/>
         </w:rPr>
-        <w:t>Arrow-key defaults, targeted A/D migration, and remapping behavior are recorded as PASS.</w:t>
+        <w:t>10:26:16–10:26:21 CEST build PASS (scoped): asset verifier, strict typecheck, Vite compile, notices; 24 files / 6,679,904 bytes; shell-v30.</w:t>
       </w:r>
     </w:p>
     <w:p>
@@ -1053,7 +1053,7 @@
           <w:vertAlign w:val="baseline"/>
           <w:rtl w:val="0"/>
         </w:rPr>
-        <w:t>Rider School completes in about 1.2 automated minutes; novice comprehension is UNVERIFIED.</w:t>
+        <w:t>Source reviews found no current P0; included corrections and regression source remain unexecuted and UNVERIFIED.</w:t>
       </w:r>
     </w:p>
     <w:p>
@@ -1096,7 +1096,7 @@
           <w:vertAlign w:val="baseline"/>
           <w:rtl w:val="0"/>
         </w:rPr>
-        <w:t>Visual regression against untouched RC1 baselines still fails pending owner acceptance.</w:t>
+        <w:t>Concept visuals are NOT ACCEPTED; no current browser or physical-device review ran.</w:t>
       </w:r>
     </w:p>
     <w:bookmarkStart w:colFirst="0" w:colLast="0" w:name="bookmark=id.4t4jj91ycfx" w:id="3"/>
@@ -1121,18 +1121,18 @@
         <w:rPr>
           <w:rtl w:val="0"/>
         </w:rPr>
-        <w:t>This report consolidates the project's design, specification, QA, readiness, asset, and fidelity records as of 14 July 2026. It separates executed evidence from manual, physical, legal, and owner-controlled work.</w:t>
-      </w:r>
-    </w:p>
-    <w:p>
-      <w:pPr>
-        <w:rPr/>
-      </w:pPr>
-      <w:r>
-        <w:rPr>
-          <w:rtl w:val="0"/>
-        </w:rPr>
-        <w:t>Its purpose is to close the user's three design concerns without overstating commercial readiness, then define the shortest credible path to one frozen, fully qualified candidate.</w:t>
+        <w:t>This report consolidates the project's design, specification, QA, readiness, asset, and fidelity records as of 15 July 2026. It separates the permitted 10:26 build's scoped compilation evidence, retained historical results, and intentionally paused validation.</w:t>
+      </w:r>
+    </w:p>
+    <w:p>
+      <w:pPr>
+        <w:rPr/>
+      </w:pPr>
+      <w:r>
+        <w:rPr>
+          <w:rtl w:val="0"/>
+        </w:rPr>
+        <w:t>Its purpose is to close the player's control, tutorial, and concept-art concerns, record the neutral folder move, and define the shortest honest path to one qualified candidate.</w:t>
       </w:r>
     </w:p>
     <w:bookmarkStart w:colFirst="0" w:colLast="0" w:name="bookmark=id.xx7bxdemqiq" w:id="4"/>
@@ -1158,7 +1158,7 @@
         <w:rPr>
           <w:rtl w:val="0"/>
         </w:rPr>
-        <w:t>Controls and tutorial scope are implemented and functionally evidenced. The remaining design risk is visual acceptance: deterministic captures show material change, not proof that the experience matches the concepts.</w:t>
+        <w:t>Corrections cover truthful HUD/results and crash counting; held-touch priority; long-route editing and one 500-module ceiling; selective, atomic profile/track/replay recovery; exact failed Test Ride retry; bounded recovery export; and short-phone accessibility. Regression source exists; all behaviors remain unverified.</w:t>
       </w:r>
     </w:p>
     <w:p>
@@ -1181,7 +1181,7 @@
         <w:rPr>
           <w:rtl w:val="0"/>
         </w:rPr>
-        <w:t>Recorded checks cover typecheck, lint, 78 unit tests, campaign qualification, local performance, soak, build, audit, manifest, and installed-Chrome smoke in stated scopes.</w:t>
+        <w:t>ArrowLeft and ArrowRight are lane defaults; exact historical A/D saves migrate without destroying occupied arrow actions. Rider School implements fresh ordered evidence, focused retry, 12 lessons, two drills, and adaptive prompts.</w:t>
       </w:r>
     </w:p>
     <w:p>
@@ -1204,7 +1204,7 @@
         <w:rPr>
           <w:rtl w:val="0"/>
         </w:rPr>
-        <w:t>Emulation is not physical hardware, automation is not novice understanding, and repeatable screenshots are not proof of concept fidelity.</w:t>
+        <w:t>The permitted 10:26:16–10:26:21 CEST normal build passed the asset verifier, strict typecheck, Vite production compilation, and notices. Lint, unit, browser, audit, manifest, smoke, performance, and soak were not run; automation remains paused.</w:t>
       </w:r>
     </w:p>
     <w:p>
@@ -1268,7 +1268,7 @@
           <w:vertAlign w:val="baseline"/>
           <w:rtl w:val="0"/>
         </w:rPr>
-        <w:t>Accept or bound the visual direction before freezing source and rerunning the final browser, device, performance, and artifact matrix.</w:t>
+        <w:t>Accept or bound the current visual direction before freezing source and rerunning the browser, device, performance, and artifact matrix.</w:t>
       </w:r>
       <w:r>
         <w:rPr>
@@ -1309,7 +1309,7 @@
         <w:rPr>
           <w:rtl w:val="0"/>
         </w:rPr>
-        <w:t>Further visual changes can invalidate build and performance evidence. Records must also be reconciled after the folder move and final artifact generation.</w:t>
+        <w:t>A shared route, dirt relief, bikes, Canyon matte, venues, safety wall, cactus, and font target the concepts. Static review still flags grade, jump, density, venue-kit, and winding-editor gaps.</w:t>
       </w:r>
     </w:p>
     <w:tbl>
@@ -1678,7 +1678,7 @@
                 <w:vertAlign w:val="baseline"/>
                 <w:rtl w:val="0"/>
               </w:rPr>
-              <w:t>Arrow cluster default; A/D remappable.</w:t>
+              <w:t>Arrow defaults; conflict-safe legacy migration.</w:t>
             </w:r>
           </w:p>
         </w:tc>
@@ -1741,7 +1741,7 @@
                 <w:vertAlign w:val="baseline"/>
                 <w:rtl w:val="0"/>
               </w:rPr>
-              <w:t>Complaint closed; physical review open.</w:t>
+              <w:t>Current behavior run paused; UNVERIFIED.</w:t>
             </w:r>
           </w:p>
         </w:tc>
@@ -1873,7 +1873,7 @@
                 <w:vertAlign w:val="baseline"/>
                 <w:rtl w:val="0"/>
               </w:rPr>
-              <w:t>12 lessons and collision drills pass.</w:t>
+              <w:t>12 lessons + 2 drills; retry and recap.</w:t>
             </w:r>
           </w:p>
         </w:tc>
@@ -1936,7 +1936,7 @@
                 <w:vertAlign w:val="baseline"/>
                 <w:rtl w:val="0"/>
               </w:rPr>
-              <w:t>Novice comprehension remains unverified.</w:t>
+              <w:t>Comprehensive in source; UNVERIFIED.</w:t>
             </w:r>
           </w:p>
         </w:tc>
@@ -2068,7 +2068,7 @@
                 <w:vertAlign w:val="baseline"/>
                 <w:rtl w:val="0"/>
               </w:rPr>
-              <w:t>Track identity and depth improved.</w:t>
+              <w:t>Route/dirt/bikes/matte; grade, jump, density gaps open.</w:t>
             </w:r>
           </w:p>
         </w:tc>
@@ -2131,7 +2131,7 @@
                 <w:vertAlign w:val="baseline"/>
                 <w:rtl w:val="0"/>
               </w:rPr>
-              <w:t>Owner fidelity decision remains open.</w:t>
+              <w:t>NOT CAPTURED / NOT ACCEPTED.</w:t>
             </w:r>
           </w:p>
         </w:tc>
@@ -2160,7 +2160,7 @@
         <w:rPr>
           <w:rtl w:val="0"/>
         </w:rPr>
-        <w:t>Close the remaining risk in this order: decide the visual target, validate learning and controls on real hardware, then freeze and qualify one exact candidate.</w:t>
+        <w:t>Close the remaining risk in this order: accept the visual target, resume current-candidate behavior and device checks, then freeze, track, tag, and bind one exact candidate.</w:t>
       </w:r>
     </w:p>
     <w:p>
@@ -2203,7 +2203,7 @@
           <w:vertAlign w:val="baseline"/>
           <w:rtl w:val="0"/>
         </w:rPr>
-        <w:t xml:space="preserve">Approve the visual direction. </w:t>
+        <w:t xml:space="preserve">Review the visual response. </w:t>
       </w:r>
       <w:r>
         <w:rPr>
@@ -2222,7 +2222,7 @@
           <w:vertAlign w:val="baseline"/>
           <w:rtl w:val="0"/>
         </w:rPr>
-        <w:t>Review desktop, portrait, high-contrast, and all five track captures against the concepts; accept them or issue bounded revisions.</w:t>
+        <w:t>Capture desktop, portrait, high-contrast, all five tracks, fallback bike, font, and authored-course isolation; accept them or issue bounded revisions.</w:t>
       </w:r>
     </w:p>
     <w:p>
@@ -2265,7 +2265,7 @@
           <w:vertAlign w:val="baseline"/>
           <w:rtl w:val="0"/>
         </w:rPr>
-        <w:t xml:space="preserve">Validate real play. </w:t>
+        <w:t xml:space="preserve">Resume validation. </w:t>
       </w:r>
       <w:r>
         <w:rPr>
@@ -2284,7 +2284,7 @@
           <w:vertAlign w:val="baseline"/>
           <w:rtl w:val="0"/>
         </w:rPr>
-        <w:t>Observe first-time players and exercise physical keyboard, touch, and gamepad controls, including accessibility modes.</w:t>
+        <w:t>Run the current static, unit, browser, accessibility, physical-input, performance, soak, audit, and offline gates; observe first-time players.</w:t>
       </w:r>
     </w:p>
     <w:p>
@@ -2327,7 +2327,7 @@
           <w:vertAlign w:val="baseline"/>
           <w:rtl w:val="0"/>
         </w:rPr>
-        <w:t xml:space="preserve">Freeze and requalify. </w:t>
+        <w:t xml:space="preserve">Freeze and bind. </w:t>
       </w:r>
       <w:r>
         <w:rPr>
@@ -2346,7 +2346,7 @@
           <w:vertAlign w:val="baseline"/>
           <w:rtl w:val="0"/>
         </w:rPr>
-        <w:t>Tie one clean commit and annotated tag to the full browser and device matrix, performance evidence, manifest, and smoke results.</w:t>
+        <w:t>Verify every intended input is tracked in one clean commit, then create an annotated tag, then generate the format-2 manifest and atomic manifest-bound smoke evidence.</w:t>
       </w:r>
     </w:p>
     <w:bookmarkStart w:colFirst="0" w:colLast="0" w:name="bookmark=id.rl3o3rp5qmnq" w:id="7"/>
@@ -2371,18 +2371,18 @@
         <w:rPr>
           <w:rtl w:val="0"/>
         </w:rPr>
-        <w:t>The engineering response is credible, and the renamed workspace removes a prohibited public-release path risk. Those wins do not erase the open product and commercial gates.</w:t>
-      </w:r>
-    </w:p>
-    <w:p>
-      <w:pPr>
-        <w:rPr/>
-      </w:pPr>
-      <w:r>
-        <w:rPr>
-          <w:rtl w:val="0"/>
-        </w:rPr>
-        <w:t>Keep status at NOT READY until visual acceptance, human and physical evidence, immutable source identity, and owner-controlled legal, hosting, provenance, and support actions close.</w:t>
+        <w:t>The permitted 10:26 build is coherent in its narrow scope, includes the current source corrections, and the neutral workspace move is complete. These are material gains, not behavioral or launch qualification while validation remains paused.</w:t>
+      </w:r>
+    </w:p>
+    <w:p>
+      <w:pPr>
+        <w:rPr/>
+      </w:pPr>
+      <w:r>
+        <w:rPr>
+          <w:rtl w:val="0"/>
+        </w:rPr>
+        <w:t>Keep status at NOT READY until current QA, performance, audit, manifest, and smoke evidence; visual and physical review; immutable identity; and owner commercial actions close.</w:t>
       </w:r>
     </w:p>
     <w:bookmarkStart w:colFirst="0" w:colLast="0" w:name="bookmark=id.cf45595vup8a" w:id="8"/>
@@ -2422,18 +2422,18 @@
         <w:rPr>
           <w:rtl w:val="0"/>
         </w:rPr>
-        <w:t>Evidence is scoped exactly as recorded: Playwright WebKit is not installed Safari, emulated mobile is not a physical device, and automation is not human comprehension.</w:t>
-      </w:r>
-    </w:p>
-    <w:p>
-      <w:pPr>
-        <w:rPr/>
-      </w:pPr>
-      <w:r>
-        <w:rPr>
-          <w:rtl w:val="0"/>
-        </w:rPr>
-        <w:t>The repository now resides at /Users/john/Sandbox/Rivet Ridge Rally. The workspace naming action is complete; release records must preserve that neutral naming.</w:t>
+        <w:t>Evidence is scoped exactly: the permitted 2026-07-15 10:26:16–10:26:21 CEST normal build is PASS only for the build-time asset verifier, strict typecheck, Vite compilation, and notices. It produced 24 files / 6,679,904 bytes with shell-v30; 1,418-byte index.html SHA-256 4252cb572300d9e2dd838b7e39f8440b8b40b6762556e17cd9f3d7b44690f433; 43,825-byte notices SHA-256 5fa8f7b4aaf95b4cc28b9b36a10c7f451e0ef83e6ac959d530ed3fdceacb60d0; and 5,722-byte sw.js SHA-256 f5cc9b23c2d507b9cede7a11cd72f62d05549c4ae72888853b5191d4cb6b78ca.</w:t>
+      </w:r>
+    </w:p>
+    <w:p>
+      <w:pPr>
+        <w:rPr/>
+      </w:pPr>
+      <w:r>
+        <w:rPr>
+          <w:rtl w:val="0"/>
+        </w:rPr>
+        <w:t>Repository: the neutral Rivet Ridge Rally workspace. The build embeds commit 62664b1f8ba814f3ec685d228fa4e600e6e7dc84 with dirty=true, so it is development evidence—not an immutable final artifact. Current corrections compile; automation remains paused; owner acceptance remains open.</w:t>
       </w:r>
     </w:p>
     <w:bookmarkStart w:colFirst="0" w:colLast="0" w:name="bookmark=id.nnk1eebni0ji" w:id="10"/>
@@ -2619,7 +2619,7 @@
           <w:vertAlign w:val="baseline"/>
           <w:rtl w:val="0"/>
         </w:rPr>
-        <w:t>Owner feedback: arrow controls, tutorial completeness, and concept-art fidelity.</w:t>
+        <w:t>Owner feedback: arrow controls, tutorial completeness, concept-art fidelity, and test pause.</w:t>
       </w:r>
     </w:p>
     <w:p>
@@ -2710,7 +2710,7 @@
           <w:vertAlign w:val="baseline"/>
           <w:rtl w:val="0"/>
         </w:rPr>
-        <w:t>The candidate remains NOT READY; do not replace visual baselines or claim launch readiness until the named gates close.</w:t>
+        <w:t>The candidate remains NOT READY: concept acceptance, current QA/performance/audit/manifest/smoke, immutable identity, and owner legal/hosting actions remain open.</w:t>
       </w:r>
     </w:p>
     <w:sectPr>
@@ -2976,7 +2976,7 @@
                   <w:szCs w:val="17"/>
                   <w:rtl w:val="0"/>
                 </w:rPr>
-                <w:t>14 July 2026</w:t>
+                <w:t>15 July 2026</w:t>
               </w:r>
             </w:p>
           </w:tc>

</xml_diff>